<commit_message>
LA MARQUE 7부 3~5화: 이름 중복 정리 (Hugo Lambert→Thomas Bourgeat, Odile Perrin→Odile Mugnier)
Co-Authored-By: Claude Opus 5.5 <noreply@anthropic.com>
Claude-Session: https://claude.ai/code/session_01N4vhCLeYxrjvGnDxQBD9Cq
</commit_message>
<xml_diff>
--- a/la-marque/대본/7부/03화_Les_voisins.docx
+++ b/la-marque/대본/7부/03화_Les_voisins.docx
@@ -50,7 +50,7 @@
         <w:t xml:space="preserve">”</w:t>
       </w:r>
       <w:r>
-        <w:t xml:space="preserve">, 공청회 의무 없음. 틸뢸 거리(북쪽 담 뒤 12채): 오딜 페랭(옛 초등 교사, 7번지, 야니크의 5학년 담임</w:t>
+        <w:t xml:space="preserve">, 공청회 의무 없음. 틸뢸 거리(북쪽 담 뒤 12채): 오딜 뮈니에(옛 초등 교사, 7번지, 야니크의 5학년 담임</w:t>
       </w:r>
       <w:r>
         <w:t xml:space="preserve"> </w:t>
@@ -83,7 +83,7 @@
         <w:t xml:space="preserve"> </w:t>
       </w:r>
       <w:r>
-        <w:t xml:space="preserve">→ 클레망스 «Oui.»(합법 ≠ 충분) → 자발적 독립 위험성 평가(8만, 석 달, 공개). 페랭 정원 센서(주민이 위치 결정, 실시간 공개). 폐수: 현장 중화·pH·BDDE 확인 → 하수처리장, 외부 실험실 월 1회, 시청에도 결과. 트럭: 남쪽 산업단지 경유, 틸뢸 거리 금지(운송 계약 위약금·표지판), 오전 7시 전·주말 납품 없음. 두 교대조 6~22시, 야간 추가 시</w:t>
+        <w:t xml:space="preserve">→ 클레망스 «Oui.»(합법 ≠ 충분) → 자발적 독립 위험성 평가(8만, 석 달, 공개). 뮈니에 정원 센서(주민이 위치 결정, 실시간 공개). 폐수: 현장 중화·pH·BDDE 확인 → 하수처리장, 외부 실험실 월 1회, 시청에도 결과. 트럭: 남쪽 산업단지 경유, 틸뢸 거리 금지(운송 계약 위약금·표지판), 오전 7시 전·주말 납품 없음. 두 교대조 6~22시, 야간 추가 시</w:t>
       </w:r>
       <w:r>
         <w:t xml:space="preserve"> </w:t>
@@ -173,7 +173,7 @@
         <w:t xml:space="preserve"> </w:t>
       </w:r>
       <w:r>
-        <w:t xml:space="preserve">- 등장인물: Clémence, Bastien, Jihoon, Yannick, Gérard, Christine Dufour, Fabienne Rey, Odile Perrin(주민 — 신규), Fabrice Ravel(주민 — 신규)</w:t>
+        <w:t xml:space="preserve">- 등장인물: Clémence, Bastien, Jihoon, Yannick, Gérard, Christine Dufour, Fabienne Rey, Odile Mugnier(주민 — 신규), Fabrice Ravel(주민 — 신규)</w:t>
       </w:r>
       <w:r>
         <w:t xml:space="preserve"> </w:t>
@@ -197,7 +197,7 @@
         <w:t xml:space="preserve"> </w:t>
       </w:r>
       <w:r>
-        <w:t xml:space="preserve">- vous/tu: 페랭→야니크 tu(옛 제자), 뒤푸르→라벨·제라르→라벨 tu, 야니크↔라벨 tu, 나머지 vous.</w:t>
+        <w:t xml:space="preserve">- vous/tu: 뮈니에→야니크 tu(옛 제자), 뒤푸르→라벨·제라르→라벨 tu, 야니크↔라벨 tu, 나머지 vous.</w:t>
       </w:r>
       <w:r>
         <w:t xml:space="preserve"> </w:t>
@@ -567,7 +567,7 @@
         <w:pStyle w:val="BodyText"/>
       </w:pPr>
       <w:r>
-        <w:t xml:space="preserve">GERARD: Mme Perrin, l’ancienne institutrice, a peur de l’odeur. Le jeune Ravel a deux enfants. Il a peur de tout.</w:t>
+        <w:t xml:space="preserve">GERARD: Mme Mugnier, l’ancienne institutrice, a peur de l’odeur. Le jeune Ravel a deux enfants. Il a peur de tout.</w:t>
       </w:r>
     </w:p>
     <w:p>
@@ -673,7 +673,7 @@
         <w:pStyle w:val="BodyText"/>
       </w:pPr>
       <w:r>
-        <w:t xml:space="preserve">PERRIN: Odile Perrin. J’habite au numéro sept, contre le mur. Combien de BDDE, madame ? En litres. Je veux un chiffre.</w:t>
+        <w:t xml:space="preserve">MUGNIER: Odile Mugnier. J’habite au numéro sept, contre le mur. Combien de BDDE, madame ? En litres. Je veux un chiffre.</w:t>
       </w:r>
     </w:p>
     <w:p>
@@ -689,7 +689,7 @@
         <w:pStyle w:val="BodyText"/>
       </w:pPr>
       <w:r>
-        <w:t xml:space="preserve">PERRIN: Deux cents litres. Et vous êtes qui, jeune homme ?</w:t>
+        <w:t xml:space="preserve">MUGNIER: Deux cents litres. Et vous êtes qui, jeune homme ?</w:t>
       </w:r>
     </w:p>
     <w:p>
@@ -721,7 +721,7 @@
         <w:pStyle w:val="BodyText"/>
       </w:pPr>
       <w:r>
-        <w:t xml:space="preserve">PERRIN: Le petit Perret. Je t’ai eu en CM2. Tu écrivais très mal.</w:t>
+        <w:t xml:space="preserve">MUGNIER: Le petit Perret. Je t’ai eu en CM2. Tu écrivais très mal.</w:t>
       </w:r>
     </w:p>
     <w:p>
@@ -817,7 +817,7 @@
         <w:pStyle w:val="BodyText"/>
       </w:pPr>
       <w:r>
-        <w:t xml:space="preserve">PERRIN: Et l’odeur ? Mon jardin est contre le mur.</w:t>
+        <w:t xml:space="preserve">MUGNIER: Et l’odeur ? Mon jardin est contre le mur.</w:t>
       </w:r>
     </w:p>
     <w:p>
@@ -833,7 +833,7 @@
         <w:pStyle w:val="BodyText"/>
       </w:pPr>
       <w:r>
-        <w:t xml:space="preserve">PERRIN: Filtré. Les gens de Bouvier disaient aussi « filtré ».</w:t>
+        <w:t xml:space="preserve">MUGNIER: Filtré. Les gens de Bouvier disaient aussi « filtré ».</w:t>
       </w:r>
     </w:p>
     <w:p>
@@ -849,15 +849,15 @@
         <w:pStyle w:val="BodyText"/>
       </w:pPr>
       <w:r>
-        <w:t xml:space="preserve">CLEMENCE: Madame Perrin, je vous propose mieux qu’une promesse. Un capteur dans votre jardin. Les mesures en ligne. Vous les voyez avant nous.</w:t>
-      </w:r>
-    </w:p>
-    <w:p>
-      <w:pPr>
-        <w:pStyle w:val="BodyText"/>
-      </w:pPr>
-      <w:r>
-        <w:t xml:space="preserve">PERRIN: Dans mon jardin ? Entre les tomates ?</w:t>
+        <w:t xml:space="preserve">CLEMENCE: Madame Mugnier, je vous propose mieux qu’une promesse. Un capteur dans votre jardin. Les mesures en ligne. Vous les voyez avant nous.</w:t>
+      </w:r>
+    </w:p>
+    <w:p>
+      <w:pPr>
+        <w:pStyle w:val="BodyText"/>
+      </w:pPr>
+      <w:r>
+        <w:t xml:space="preserve">MUGNIER: Dans mon jardin ? Entre les tomates ?</w:t>
       </w:r>
     </w:p>
     <w:p>
@@ -955,7 +955,7 @@
         <w:pStyle w:val="BodyText"/>
       </w:pPr>
       <w:r>
-        <w:t xml:space="preserve">PERRIN: Et les camions ? La rue des Tilleuls est étroite. Il y a l’école au bout.</w:t>
+        <w:t xml:space="preserve">MUGNIER: Et les camions ? La rue des Tilleuls est étroite. Il y a l’école au bout.</w:t>
       </w:r>
     </w:p>
     <w:p>
@@ -971,7 +971,7 @@
         <w:pStyle w:val="BodyText"/>
       </w:pPr>
       <w:r>
-        <w:t xml:space="preserve">PERRIN: Jamais ? Les chauffeurs suivent leur GPS.</w:t>
+        <w:t xml:space="preserve">MUGNIER: Jamais ? Les chauffeurs suivent leur GPS.</w:t>
       </w:r>
     </w:p>
     <w:p>
@@ -1035,7 +1035,7 @@
         <w:pStyle w:val="BodyText"/>
       </w:pPr>
       <w:r>
-        <w:t xml:space="preserve">PERRIN: Il y a aussi la ventilation. Une salle blanche, ça souffle tout le temps, non ? Mon neveu travaille à Grenoble.</w:t>
+        <w:t xml:space="preserve">MUGNIER: Il y a aussi la ventilation. Une salle blanche, ça souffle tout le temps, non ? Mon neveu travaille à Grenoble.</w:t>
       </w:r>
     </w:p>
     <w:p>
@@ -1051,7 +1051,7 @@
         <w:pStyle w:val="BodyText"/>
       </w:pPr>
       <w:r>
-        <w:t xml:space="preserve">PERRIN: Un chat de l’usine. J’en ai déjà un, de chat.</w:t>
+        <w:t xml:space="preserve">MUGNIER: Un chat de l’usine. J’en ai déjà un, de chat.</w:t>
       </w:r>
     </w:p>
     <w:p>
@@ -1067,7 +1067,7 @@
         <w:pStyle w:val="BodyText"/>
       </w:pPr>
       <w:r>
-        <w:t xml:space="preserve">PERRIN: Et si le chat ronronne trop fort ?</w:t>
+        <w:t xml:space="preserve">MUGNIER: Et si le chat ronronne trop fort ?</w:t>
       </w:r>
     </w:p>
     <w:p>
@@ -1325,15 +1325,15 @@
         <w:pStyle w:val="BodyText"/>
       </w:pPr>
       <w:r>
-        <w:t xml:space="preserve">PERRIN: Moi aussi, je me présente. Et mon jardin est disponible pour votre capteur. Entre les tomates et les dahlias.</w:t>
-      </w:r>
-    </w:p>
-    <w:p>
-      <w:pPr>
-        <w:pStyle w:val="BodyText"/>
-      </w:pPr>
-      <w:r>
-        <w:t xml:space="preserve">DUFOUR: Je note : comité de suivi de site, six riverains, Mme Perrin et M. Ravel candidats. Élection en septembre.</w:t>
+        <w:t xml:space="preserve">MUGNIER: Moi aussi, je me présente. Et mon jardin est disponible pour votre capteur. Entre les tomates et les dahlias.</w:t>
+      </w:r>
+    </w:p>
+    <w:p>
+      <w:pPr>
+        <w:pStyle w:val="BodyText"/>
+      </w:pPr>
+      <w:r>
+        <w:t xml:space="preserve">DUFOUR: Je note : comité de suivi de site, six riverains, Mme Mugnier et M. Ravel candidats. Élection en septembre.</w:t>
       </w:r>
     </w:p>
     <w:p>
@@ -1391,7 +1391,7 @@
         <w:pStyle w:val="BodyText"/>
       </w:pPr>
       <w:r>
-        <w:t xml:space="preserve">GERARD: Odile Perrin m’a dit en sortant : « Ta fille parle comme un procès-verbal. » Chez elle, c’est un compliment.</w:t>
+        <w:t xml:space="preserve">GERARD: Odile Mugnier m’a dit en sortant : « Ta fille parle comme un procès-verbal. » Chez elle, c’est un compliment.</w:t>
       </w:r>
     </w:p>
     <w:p>
@@ -3205,7 +3205,7 @@
         <w:pStyle w:val="BodyText"/>
       </w:pPr>
       <w:r>
-        <w:t xml:space="preserve">제라르: 옛 선생님 페랭 부인은 냄새를 걱정해. 젊은 라벨은 애가 둘이야. 모든 게 걱정이지.</w:t>
+        <w:t xml:space="preserve">제라르: 옛 선생님 뮈니에 부인은 냄새를 걱정해. 젊은 라벨은 애가 둘이야. 모든 게 걱정이지.</w:t>
       </w:r>
     </w:p>
     <w:p>
@@ -3311,7 +3311,7 @@
         <w:pStyle w:val="BodyText"/>
       </w:pPr>
       <w:r>
-        <w:t xml:space="preserve">페랭: 오딜 페랭이에요. 담에 붙은 7번지에 살아요. BDDE가 얼마나 되죠? 리터로요. 숫자를 원해요.</w:t>
+        <w:t xml:space="preserve">뮈니에: 오딜 뮈니에이에요. 담에 붙은 7번지에 살아요. BDDE가 얼마나 되죠? 리터로요. 숫자를 원해요.</w:t>
       </w:r>
     </w:p>
     <w:p>
@@ -3327,7 +3327,7 @@
         <w:pStyle w:val="BodyText"/>
       </w:pPr>
       <w:r>
-        <w:t xml:space="preserve">페랭: 200리터. 그런데 젊은이는 누구죠?</w:t>
+        <w:t xml:space="preserve">뮈니에: 200리터. 그런데 젊은이는 누구죠?</w:t>
       </w:r>
     </w:p>
     <w:p>
@@ -3359,7 +3359,7 @@
         <w:pStyle w:val="BodyText"/>
       </w:pPr>
       <w:r>
-        <w:t xml:space="preserve">페랭: 페레네 막내. 초등학교 5학년 때 내가 가르쳤지. 글씨를 정말 못 썼는데.</w:t>
+        <w:t xml:space="preserve">뮈니에: 페레네 막내. 초등학교 5학년 때 내가 가르쳤지. 글씨를 정말 못 썼는데.</w:t>
       </w:r>
     </w:p>
     <w:p>
@@ -3455,7 +3455,7 @@
         <w:pStyle w:val="BodyText"/>
       </w:pPr>
       <w:r>
-        <w:t xml:space="preserve">페랭: 그리고 냄새는요? 내 정원이 담에 붙어 있어요.</w:t>
+        <w:t xml:space="preserve">뮈니에: 그리고 냄새는요? 내 정원이 담에 붙어 있어요.</w:t>
       </w:r>
     </w:p>
     <w:p>
@@ -3471,7 +3471,7 @@
         <w:pStyle w:val="BodyText"/>
       </w:pPr>
       <w:r>
-        <w:t xml:space="preserve">페랭: 필터. 부비에 사람들도 「필터」라고 했어요.</w:t>
+        <w:t xml:space="preserve">뮈니에: 필터. 부비에 사람들도 「필터」라고 했어요.</w:t>
       </w:r>
     </w:p>
     <w:p>
@@ -3487,15 +3487,15 @@
         <w:pStyle w:val="BodyText"/>
       </w:pPr>
       <w:r>
-        <w:t xml:space="preserve">클레망스: 페랭 부인, 약속보다 나은 걸 드릴게요. 정원에 센서 하나. 측정값은 온라인으로. 우리보다 먼저 보세요.</w:t>
-      </w:r>
-    </w:p>
-    <w:p>
-      <w:pPr>
-        <w:pStyle w:val="BodyText"/>
-      </w:pPr>
-      <w:r>
-        <w:t xml:space="preserve">페랭: 내 정원에? 토마토 사이에?</w:t>
+        <w:t xml:space="preserve">클레망스: 뮈니에 부인, 약속보다 나은 걸 드릴게요. 정원에 센서 하나. 측정값은 온라인으로. 우리보다 먼저 보세요.</w:t>
+      </w:r>
+    </w:p>
+    <w:p>
+      <w:pPr>
+        <w:pStyle w:val="BodyText"/>
+      </w:pPr>
+      <w:r>
+        <w:t xml:space="preserve">뮈니에: 내 정원에? 토마토 사이에?</w:t>
       </w:r>
     </w:p>
     <w:p>
@@ -3593,7 +3593,7 @@
         <w:pStyle w:val="BodyText"/>
       </w:pPr>
       <w:r>
-        <w:t xml:space="preserve">페랭: 트럭은요? 틸뢸 거리는 좁아요. 끝에 학교가 있어요.</w:t>
+        <w:t xml:space="preserve">뮈니에: 트럭은요? 틸뢸 거리는 좁아요. 끝에 학교가 있어요.</w:t>
       </w:r>
     </w:p>
     <w:p>
@@ -3609,7 +3609,7 @@
         <w:pStyle w:val="BodyText"/>
       </w:pPr>
       <w:r>
-        <w:t xml:space="preserve">페랭: 절대? 기사들은 내비게이션을 따라가요.</w:t>
+        <w:t xml:space="preserve">뮈니에: 절대? 기사들은 내비게이션을 따라가요.</w:t>
       </w:r>
     </w:p>
     <w:p>
@@ -3673,7 +3673,7 @@
         <w:pStyle w:val="BodyText"/>
       </w:pPr>
       <w:r>
-        <w:t xml:space="preserve">페랭: 환기도 있잖아요. 클린룸은 계속 바람을 내보내죠? 조카가 그르노블에서 일해요.</w:t>
+        <w:t xml:space="preserve">뮈니에: 환기도 있잖아요. 클린룸은 계속 바람을 내보내죠? 조카가 그르노블에서 일해요.</w:t>
       </w:r>
     </w:p>
     <w:p>
@@ -3689,7 +3689,7 @@
         <w:pStyle w:val="BodyText"/>
       </w:pPr>
       <w:r>
-        <w:t xml:space="preserve">페랭: 공장 고양이라. 고양이는 이미 한 마리 있어요.</w:t>
+        <w:t xml:space="preserve">뮈니에: 공장 고양이라. 고양이는 이미 한 마리 있어요.</w:t>
       </w:r>
     </w:p>
     <w:p>
@@ -3705,7 +3705,7 @@
         <w:pStyle w:val="BodyText"/>
       </w:pPr>
       <w:r>
-        <w:t xml:space="preserve">페랭: 고양이가 너무 크게 가르랑거리면요?</w:t>
+        <w:t xml:space="preserve">뮈니에: 고양이가 너무 크게 가르랑거리면요?</w:t>
       </w:r>
     </w:p>
     <w:p>
@@ -3963,15 +3963,15 @@
         <w:pStyle w:val="BodyText"/>
       </w:pPr>
       <w:r>
-        <w:t xml:space="preserve">페랭: 나도 출마할게요. 그리고 센서는 내 정원에 두세요. 토마토와 달리아 사이에.</w:t>
-      </w:r>
-    </w:p>
-    <w:p>
-      <w:pPr>
-        <w:pStyle w:val="BodyText"/>
-      </w:pPr>
-      <w:r>
-        <w:t xml:space="preserve">뒤푸르: 적겠습니다. 현장 감시위원회, 주민 여섯 명, 페랭 부인과 라벨 씨 출마. 선거는 9월.</w:t>
+        <w:t xml:space="preserve">뮈니에: 나도 출마할게요. 그리고 센서는 내 정원에 두세요. 토마토와 달리아 사이에.</w:t>
+      </w:r>
+    </w:p>
+    <w:p>
+      <w:pPr>
+        <w:pStyle w:val="BodyText"/>
+      </w:pPr>
+      <w:r>
+        <w:t xml:space="preserve">뒤푸르: 적겠습니다. 현장 감시위원회, 주민 여섯 명, 뮈니에 부인과 라벨 씨 출마. 선거는 9월.</w:t>
       </w:r>
     </w:p>
     <w:p>
@@ -4029,7 +4029,7 @@
         <w:pStyle w:val="BodyText"/>
       </w:pPr>
       <w:r>
-        <w:t xml:space="preserve">제라르: 오딜 페랭이 나가면서 그러더라. 「네 딸은 회의록처럼 말해.」 그 양반한텐 칭찬이야.</w:t>
+        <w:t xml:space="preserve">제라르: 오딜 뮈니에이 나가면서 그러더라. 「네 딸은 회의록처럼 말해.」 그 양반한텐 칭찬이야.</w:t>
       </w:r>
     </w:p>
     <w:p>

</xml_diff>